<commit_message>
Incorporate PICC private placement plan terms into report
Co-Authored-By: Claude Fable 5.1 <noreply@anthropic.com>
Claude-Session: https://claude.ai/code/session_01L8aigT8rcgficjTBusL67d
</commit_message>
<xml_diff>
--- a/mof-insurer-injection-2026-09/report.docx
+++ b/mof-insurer-injection-2026-09/report.docx
@@ -95,7 +95,7 @@
               <w:rPr>
                 <w:sz w:val="18"/>
               </w:rPr>
-              <w:t>2026 年 9 月 6 日（事件當天，尚未經過任何一個交易日）</w:t>
+              <w:t>2026 年 9 月 6 日初版；9 月 7 日補入人保定增預案條款</w:t>
             </w:r>
           </w:p>
         </w:tc>
@@ -2315,16 +2315,493 @@
     <w:p/>
     <w:p>
       <w:r>
-        <w:t>只有人保這一家，市場可以直接觀察到「稀釋 vs. 增厚」效應。人保定增的發行價格、股數、發行後財政部持股比例，各工單都</w:t>
+        <w:t>只有人保這一家，市場可以直接觀察到「稀釋 vs. 增厚」效應。人保 9 月 6 日晚間披露的《向特定對象發行 A 股股票預案》核心條款如下（依使用者提供之預案整理，9 月 7 日補入）：</w:t>
+      </w:r>
+    </w:p>
+    <w:tbl>
+      <w:tblPr>
+        <w:tblStyle w:val="TableGrid"/>
+        <w:tblW w:type="auto" w:w="0"/>
+        <w:tblLook w:firstColumn="1" w:firstRow="1" w:lastColumn="0" w:lastRow="0" w:noHBand="0" w:noVBand="1" w:val="04A0"/>
+      </w:tblPr>
+      <w:tblGrid>
+        <w:gridCol w:w="4986"/>
+        <w:gridCol w:w="4986"/>
+      </w:tblGrid>
+      <w:tr>
+        <w:tc>
+          <w:tcPr>
+            <w:tcW w:type="dxa" w:w="4986"/>
+          </w:tcPr>
+          <w:p>
+            <w:r>
+              <w:rPr>
+                <w:b/>
+                <w:sz w:val="18"/>
+              </w:rPr>
+            </w:r>
+            <w:r>
+              <w:rPr>
+                <w:b/>
+                <w:sz w:val="18"/>
+              </w:rPr>
+              <w:t>項目</w:t>
+            </w:r>
+          </w:p>
+        </w:tc>
+        <w:tc>
+          <w:tcPr>
+            <w:tcW w:type="dxa" w:w="4986"/>
+          </w:tcPr>
+          <w:p>
+            <w:r>
+              <w:rPr>
+                <w:b/>
+                <w:sz w:val="18"/>
+              </w:rPr>
+            </w:r>
+            <w:r>
+              <w:rPr>
+                <w:b/>
+                <w:sz w:val="18"/>
+              </w:rPr>
+              <w:t>預案內容</w:t>
+            </w:r>
+          </w:p>
+        </w:tc>
+      </w:tr>
+      <w:tr>
+        <w:tc>
+          <w:tcPr>
+            <w:tcW w:type="dxa" w:w="4986"/>
+          </w:tcPr>
+          <w:p>
+            <w:r>
+              <w:rPr>
+                <w:sz w:val="18"/>
+              </w:rPr>
+            </w:r>
+            <w:r>
+              <w:rPr>
+                <w:sz w:val="18"/>
+              </w:rPr>
+              <w:t>發行對象</w:t>
+            </w:r>
+          </w:p>
+        </w:tc>
+        <w:tc>
+          <w:tcPr>
+            <w:tcW w:type="dxa" w:w="4986"/>
+          </w:tcPr>
+          <w:p>
+            <w:r>
+              <w:rPr>
+                <w:sz w:val="18"/>
+              </w:rPr>
+            </w:r>
+            <w:r>
+              <w:rPr>
+                <w:sz w:val="18"/>
+              </w:rPr>
+              <w:t>財政部，以現金全額認購</w:t>
+            </w:r>
+          </w:p>
+        </w:tc>
+      </w:tr>
+      <w:tr>
+        <w:tc>
+          <w:tcPr>
+            <w:tcW w:type="dxa" w:w="4986"/>
+          </w:tcPr>
+          <w:p>
+            <w:r>
+              <w:rPr>
+                <w:sz w:val="18"/>
+              </w:rPr>
+            </w:r>
+            <w:r>
+              <w:rPr>
+                <w:sz w:val="18"/>
+              </w:rPr>
+              <w:t>募資總額</w:t>
+            </w:r>
+          </w:p>
+        </w:tc>
+        <w:tc>
+          <w:tcPr>
+            <w:tcW w:type="dxa" w:w="4986"/>
+          </w:tcPr>
+          <w:p>
+            <w:r>
+              <w:rPr>
+                <w:sz w:val="18"/>
+              </w:rPr>
+            </w:r>
+            <w:r>
+              <w:rPr>
+                <w:sz w:val="18"/>
+              </w:rPr>
+              <w:t>不超過 150 億元（含）</w:t>
+            </w:r>
+          </w:p>
+        </w:tc>
+      </w:tr>
+      <w:tr>
+        <w:tc>
+          <w:tcPr>
+            <w:tcW w:type="dxa" w:w="4986"/>
+          </w:tcPr>
+          <w:p>
+            <w:r>
+              <w:rPr>
+                <w:sz w:val="18"/>
+              </w:rPr>
+            </w:r>
+            <w:r>
+              <w:rPr>
+                <w:sz w:val="18"/>
+              </w:rPr>
+              <w:t>定價基準日</w:t>
+            </w:r>
+          </w:p>
+        </w:tc>
+        <w:tc>
+          <w:tcPr>
+            <w:tcW w:type="dxa" w:w="4986"/>
+          </w:tcPr>
+          <w:p>
+            <w:r>
+              <w:rPr>
+                <w:sz w:val="18"/>
+              </w:rPr>
+            </w:r>
+            <w:r>
+              <w:rPr>
+                <w:sz w:val="18"/>
+              </w:rPr>
+              <w:t>發行期首日</w:t>
+            </w:r>
+          </w:p>
+        </w:tc>
+      </w:tr>
+      <w:tr>
+        <w:tc>
+          <w:tcPr>
+            <w:tcW w:type="dxa" w:w="4986"/>
+          </w:tcPr>
+          <w:p>
+            <w:r>
+              <w:rPr>
+                <w:sz w:val="18"/>
+              </w:rPr>
+            </w:r>
+            <w:r>
+              <w:rPr>
+                <w:sz w:val="18"/>
+              </w:rPr>
+              <w:t>定價原則</w:t>
+            </w:r>
+          </w:p>
+        </w:tc>
+        <w:tc>
+          <w:tcPr>
+            <w:tcW w:type="dxa" w:w="4986"/>
+          </w:tcPr>
+          <w:p>
+            <w:r>
+              <w:rPr>
+                <w:sz w:val="18"/>
+              </w:rPr>
+            </w:r>
+            <w:r>
+              <w:rPr>
+                <w:sz w:val="18"/>
+              </w:rPr>
+              <w:t>不低於定價基準日前 20 個交易日 A 股均價（進一法保留兩位小數），最終價格待監管批復後確定</w:t>
+            </w:r>
+          </w:p>
+        </w:tc>
+      </w:tr>
+      <w:tr>
+        <w:tc>
+          <w:tcPr>
+            <w:tcW w:type="dxa" w:w="4986"/>
+          </w:tcPr>
+          <w:p>
+            <w:r>
+              <w:rPr>
+                <w:sz w:val="18"/>
+              </w:rPr>
+            </w:r>
+            <w:r>
+              <w:rPr>
+                <w:sz w:val="18"/>
+              </w:rPr>
+              <w:t>發行數量</w:t>
+            </w:r>
+          </w:p>
+        </w:tc>
+        <w:tc>
+          <w:tcPr>
+            <w:tcW w:type="dxa" w:w="4986"/>
+          </w:tcPr>
+          <w:p>
+            <w:r>
+              <w:rPr>
+                <w:sz w:val="18"/>
+              </w:rPr>
+            </w:r>
+            <w:r>
+              <w:rPr>
+                <w:sz w:val="18"/>
+              </w:rPr>
+              <w:t>募資總額 ÷ 發行價格，以監管核准／註冊數量為準</w:t>
+            </w:r>
+          </w:p>
+        </w:tc>
+      </w:tr>
+      <w:tr>
+        <w:tc>
+          <w:tcPr>
+            <w:tcW w:type="dxa" w:w="4986"/>
+          </w:tcPr>
+          <w:p>
+            <w:r>
+              <w:rPr>
+                <w:sz w:val="18"/>
+              </w:rPr>
+            </w:r>
+            <w:r>
+              <w:rPr>
+                <w:sz w:val="18"/>
+              </w:rPr>
+              <w:t>鎖定期</w:t>
+            </w:r>
+          </w:p>
+        </w:tc>
+        <w:tc>
+          <w:tcPr>
+            <w:tcW w:type="dxa" w:w="4986"/>
+          </w:tcPr>
+          <w:p>
+            <w:r>
+              <w:rPr>
+                <w:sz w:val="18"/>
+              </w:rPr>
+            </w:r>
+            <w:r>
+              <w:rPr>
+                <w:sz w:val="18"/>
+              </w:rPr>
+              <w:t>財政部所認股份自登記日起 5 年內不得轉讓</w:t>
+            </w:r>
+          </w:p>
+        </w:tc>
+      </w:tr>
+      <w:tr>
+        <w:tc>
+          <w:tcPr>
+            <w:tcW w:type="dxa" w:w="4986"/>
+          </w:tcPr>
+          <w:p>
+            <w:r>
+              <w:rPr>
+                <w:sz w:val="18"/>
+              </w:rPr>
+            </w:r>
+            <w:r>
+              <w:rPr>
+                <w:sz w:val="18"/>
+              </w:rPr>
+              <w:t>決議有效期</w:t>
+            </w:r>
+          </w:p>
+        </w:tc>
+        <w:tc>
+          <w:tcPr>
+            <w:tcW w:type="dxa" w:w="4986"/>
+          </w:tcPr>
+          <w:p>
+            <w:r>
+              <w:rPr>
+                <w:sz w:val="18"/>
+              </w:rPr>
+            </w:r>
+            <w:r>
+              <w:rPr>
+                <w:sz w:val="18"/>
+              </w:rPr>
+              <w:t>股東會通過後 12 個月</w:t>
+            </w:r>
+          </w:p>
+        </w:tc>
+      </w:tr>
+      <w:tr>
+        <w:tc>
+          <w:tcPr>
+            <w:tcW w:type="dxa" w:w="4986"/>
+          </w:tcPr>
+          <w:p>
+            <w:r>
+              <w:rPr>
+                <w:sz w:val="18"/>
+              </w:rPr>
+            </w:r>
+            <w:r>
+              <w:rPr>
+                <w:sz w:val="18"/>
+              </w:rPr>
+              <w:t>資金用途</w:t>
+            </w:r>
+          </w:p>
+        </w:tc>
+        <w:tc>
+          <w:tcPr>
+            <w:tcW w:type="dxa" w:w="4986"/>
+          </w:tcPr>
+          <w:p>
+            <w:r>
+              <w:rPr>
+                <w:sz w:val="18"/>
+              </w:rPr>
+            </w:r>
+            <w:r>
+              <w:rPr>
+                <w:sz w:val="18"/>
+              </w:rPr>
+              <w:t>扣除費用後全部充實資本金（核心一級資本）</w:t>
+            </w:r>
+          </w:p>
+        </w:tc>
+      </w:tr>
+      <w:tr>
+        <w:tc>
+          <w:tcPr>
+            <w:tcW w:type="dxa" w:w="4986"/>
+          </w:tcPr>
+          <w:p>
+            <w:r>
+              <w:rPr>
+                <w:sz w:val="18"/>
+              </w:rPr>
+            </w:r>
+            <w:r>
+              <w:rPr>
+                <w:sz w:val="18"/>
+              </w:rPr>
+              <w:t>關聯交易</w:t>
+            </w:r>
+          </w:p>
+        </w:tc>
+        <w:tc>
+          <w:tcPr>
+            <w:tcW w:type="dxa" w:w="4986"/>
+          </w:tcPr>
+          <w:p>
+            <w:r>
+              <w:rPr>
+                <w:sz w:val="18"/>
+              </w:rPr>
+            </w:r>
+            <w:r>
+              <w:rPr>
+                <w:sz w:val="18"/>
+              </w:rPr>
+              <w:t>財政部現持 269.07 億股、60.84%，為控股股東，構成關聯交易；發行後控制權不變</w:t>
+            </w:r>
+          </w:p>
+        </w:tc>
+      </w:tr>
+      <w:tr>
+        <w:tc>
+          <w:tcPr>
+            <w:tcW w:type="dxa" w:w="4986"/>
+          </w:tcPr>
+          <w:p>
+            <w:r>
+              <w:rPr>
+                <w:sz w:val="18"/>
+              </w:rPr>
+            </w:r>
+            <w:r>
+              <w:rPr>
+                <w:sz w:val="18"/>
+              </w:rPr>
+              <w:t>滾存利潤</w:t>
+            </w:r>
+          </w:p>
+        </w:tc>
+        <w:tc>
+          <w:tcPr>
+            <w:tcW w:type="dxa" w:w="4986"/>
+          </w:tcPr>
+          <w:p>
+            <w:r>
+              <w:rPr>
+                <w:sz w:val="18"/>
+              </w:rPr>
+            </w:r>
+            <w:r>
+              <w:rPr>
+                <w:sz w:val="18"/>
+              </w:rPr>
+              <w:t>發行前未分配利潤由新老股東按發行後持股比例共享</w:t>
+            </w:r>
+          </w:p>
+        </w:tc>
+      </w:tr>
+      <w:tr>
+        <w:tc>
+          <w:tcPr>
+            <w:tcW w:type="dxa" w:w="4986"/>
+          </w:tcPr>
+          <w:p>
+            <w:r>
+              <w:rPr>
+                <w:sz w:val="18"/>
+              </w:rPr>
+            </w:r>
+            <w:r>
+              <w:rPr>
+                <w:sz w:val="18"/>
+              </w:rPr>
+              <w:t>審批鏈</w:t>
+            </w:r>
+          </w:p>
+        </w:tc>
+        <w:tc>
+          <w:tcPr>
+            <w:tcW w:type="dxa" w:w="4986"/>
+          </w:tcPr>
+          <w:p>
+            <w:r>
+              <w:rPr>
+                <w:sz w:val="18"/>
+              </w:rPr>
+            </w:r>
+            <w:r>
+              <w:rPr>
+                <w:sz w:val="18"/>
+              </w:rPr>
+              <w:t>董事會已通過（關聯董事迴避）→ 股東會逐項表決 → 金融監管總局批准 → 上交所審核 → 證監會同意註冊</w:t>
+            </w:r>
+          </w:p>
+        </w:tc>
+      </w:tr>
+    </w:tbl>
+    <w:p/>
+    <w:p>
+      <w:r>
+        <w:t xml:space="preserve">三個值得注意的地方：(1) 定價下限是前 20 日均價的 </w:t>
       </w:r>
       <w:r>
         <w:rPr>
           <w:b/>
         </w:rPr>
-        <w:t>未查得</w:t>
+        <w:t>100%</w:t>
       </w:r>
       <w:r>
-        <w:t>（預案階段，尚待股東會與監管核准）。可參考的先例是 2025 年建行案：財政部認購價較市價溢價約 15%，官方稱對原股東每股收益攤薄比率較小。</w:t>
+        <w:t>，比一般定增規則的 80% 嚴格，等於財政部不打折入股，對中小股東的攤薄降到最低；2025 年大行案例更是溢價約 15% 認購。(2) 5 年鎖定與 2025 年大行案相同，財政部是長期持有而非財務投資。(3) 預案自述的目的直接點名「化解長期利差匹配壓力」與「發揮耐心資本角色」，與本報告第四部的原因診斷一致。最終發行價、股數、發行後財政部持股比例仍要等監管批復後才有。</w:t>
       </w:r>
     </w:p>
     <w:p>
@@ -3299,7 +3776,7 @@
                 <w:b/>
                 <w:sz w:val="18"/>
               </w:rPr>
-              <w:t>8 家中央金融企業同步公告；財政部宣布特別國債支持 8 家補充核心一級資本；財新 17:37 發稿</w:t>
+              <w:t>8 家中央金融企業同步公告；財政部宣布特別國債支持 8 家補充核心一級資本；財新 17:37 發稿；人保晚間披露定增預案（定價不低於前 20 日均價、5 年鎖定）</w:t>
             </w:r>
           </w:p>
         </w:tc>
@@ -3317,7 +3794,7 @@
               <w:rPr>
                 <w:sz w:val="18"/>
               </w:rPr>
-              <w:t>多來源一致</w:t>
+              <w:t>多來源一致；人保預案為使用者提供</w:t>
             </w:r>
           </w:p>
         </w:tc>
@@ -4450,7 +4927,7 @@
         <w:t>股權</w:t>
       </w:r>
       <w:r>
-        <w:t>：人壽、太平、信保注資在母公司層面，上市子公司股本不動；人保是上市公司定增，財政部持股將由 60.84% 進一步上升，中小股東被稀釋，幅度取決於定價（未公布）。</w:t>
+        <w:t>：人壽、太平、信保注資在母公司層面，上市子公司股本不動；人保是上市公司定增，財政部持股將由 60.84% 進一步上升，中小股東持股比例被稀釋，但因定價不低於前 20 日均價、且滾存利潤新老股東共享，每股淨資產與每股收益的攤薄有限。粗估：若以 2026 年 4 月末約 7.2 元／股的價位計，150 億元約對應 20 億股左右，占發行前總股本（約 442 億股）不到 5%，財政部持股約升至 62% 上下（假設性推算，以最終定價為準）。</w:t>
       </w:r>
     </w:p>
     <w:p>
@@ -5579,10 +6056,10 @@
         <w:rPr>
           <w:b/>
         </w:rPr>
-        <w:t>人保定增條款</w:t>
+        <w:t>人保定增最終條款</w:t>
       </w:r>
       <w:r>
-        <w:t>：發行價、股數、財政部發行後持股比例、對每股淨資產的影響。</w:t>
+        <w:t>：定價原則、鎖定期、審批鏈已由預案確認（見第二部三）；最終發行價、股數、發行後財政部持股比例仍待監管批復。</w:t>
       </w:r>
     </w:p>
     <w:p>

</xml_diff>

<commit_message>
Update report with Caixin 19:03 revision (5 insurers, 70bn) and expert commentary
Co-Authored-By: Claude Fable 5.1 <noreply@anthropic.com>
Claude-Session: https://claude.ai/code/session_01L8aigT8rcgficjTBusL67d
</commit_message>
<xml_diff>
--- a/mof-insurer-injection-2026-09/report.docx
+++ b/mof-insurer-injection-2026-09/report.docx
@@ -95,7 +95,7 @@
               <w:rPr>
                 <w:sz w:val="18"/>
               </w:rPr>
-              <w:t>2026 年 9 月 6 日初版；9 月 7 日補入人保定增預案條款</w:t>
+              <w:t>2026 年 9 月 6 日初版；9 月 7 日補入人保定增預案條款、財新 19:03 更新版與專家解讀</w:t>
             </w:r>
           </w:p>
         </w:tc>
@@ -133,7 +133,20 @@
               <w:rPr>
                 <w:sz w:val="18"/>
               </w:rPr>
-              <w:t>財新網〈财政部首次注资险企 4家获670亿元〉，記者吳雨儉，2026-09-06 17:37</w:t>
+              <w:t>財新網〈财政部首次注资险企 4家获670亿元〉，記者吳雨儉，2026-09-06 17:37；</w:t>
+            </w:r>
+            <w:r>
+              <w:rPr>
+                <w:b/>
+                <w:sz w:val="18"/>
+              </w:rPr>
+              <w:t>同日 19:03 更新為〈财政部首次注资险企 5家获700亿元（更新）〉</w:t>
+            </w:r>
+            <w:r>
+              <w:rPr>
+                <w:sz w:val="18"/>
+              </w:rPr>
+              <w:t>（finance.caixin.com/2026-09-06/102482419.html）</w:t>
             </w:r>
           </w:p>
         </w:tc>
@@ -298,7 +311,7 @@
               <w:rPr>
                 <w:sz w:val="18"/>
               </w:rPr>
-              <w:t>，所有內容是靠搜尋引擎摘要多來源交叉比對重建。可信度分級見各段標註。</w:t>
+              <w:t>，所有內容是靠搜尋引擎摘要多來源交叉比對重建。9 月 7 日透過搜尋摘要取得財新更新版標題與導語要點、人保預案由使用者提供。可信度分級見各段標註。</w:t>
             </w:r>
           </w:p>
         </w:tc>
@@ -683,16 +696,13 @@
     <w:p/>
     <w:p>
       <w:r>
-        <w:t>同日還有中國再保險獲財政部認購 30 億元內資股。若把它算進來就是「5 家 700 億」，路透系英文通稿則只算「3 家 570 億」（不含信保、中再）。三種口徑並存，</w:t>
-      </w:r>
-      <w:r>
         <w:rPr>
           <w:b/>
         </w:rPr>
-        <w:t>財新的「4 家 670 億」最合理的解釋是把政策性的中國信保算進去、把再保險公司另計</w:t>
+        <w:t>名單已獲證實。</w:t>
       </w:r>
       <w:r>
-        <w:t>（依據：只有這個組合加總正好等於 670）。</w:t>
+        <w:t xml:space="preserve"> 財新當晚 19:03 把標題更新為「5 家獲 700 億元」，即上表 4 家再加上中國再保險（財政部認購 30 億元內資股）。截圖上的「4 家 670 億」是 17:37 的初版，中再的定增公告晚一步披露後財新補進去。本報告用算術推定的 4 家名單（含中國信保）與財新更新版完全一致。路透系英文通稿只算「3 家 570 億」，是因為它不把政策性的信保與再保險公司算作 insurers。</w:t>
       </w:r>
     </w:p>
     <w:p>
@@ -723,7 +733,7 @@
         <w:t>「比預期提前」是什麼意思。</w:t>
       </w:r>
       <w:r>
-        <w:t xml:space="preserve"> 2026 年 3 月的政府工作報告只說 3,000 億特別國債「支持國有大型商業銀行補充資本」，沒有提保險；市場普遍認為這筆錢是給工行、農行的，券商（中泰證券，3 月）更明確預測保險央企注資「至少推遲到 2027 年」。結果 9 月揭曉：財政部把這 3,000 億拆成「銀行 2,000 億 + 進出口銀行 300 億 + 保險類 700 億」，讓保險提前一年多進場。這就是財新所說「相關部門綜合考慮後對資金安排做出的相應優化」最合理的解讀（屬本報告推論，官方未逐字說明）。</w:t>
+        <w:t xml:space="preserve"> 2026 年 3 月的政府工作報告只說 3,000 億特別國債「支持國有大型商業銀行補充資本」，沒有提保險；市場普遍認為這筆錢是給工行、農行的，券商（中泰證券，3 月）更明確預測保險央企注資「至少推遲到 2027 年」。結果 9 月揭曉：財政部把這 3,000 億拆成「銀行 2,000 億 + 進出口銀行 300 億 + 保險類 700 億」，讓保險提前一年多進場。財新更新版正文（經搜尋摘要）給的解釋與此一致：因政府工作報告未提保險機構，市場原以為保險資本補充要到 2027 年。財新同日另一篇〈第二批特別國債注資銀行落地 農行、工行、進出口行合計 2,300 億元〉也印證 2,300 + 700 = 3,000，就是同一筆特別國債。</w:t>
       </w:r>
     </w:p>
     <w:p>
@@ -754,7 +764,7 @@
         <w:t>還沒確定的事。</w:t>
       </w:r>
       <w:r>
-        <w:t xml:space="preserve"> 財新原文全文、「首次」的精確定義（2023 年財政部已對中國太平注資過 25 億元）、人保定增的價格與股數、注資是否附帶條件、9 月 7 日以後的市場反應、以及 1 月彭博傳聞的 2,000 億為何縮水到 700 億。詳見第七部。</w:t>
+        <w:t xml:space="preserve"> 財新正文全文（僅有摘要）、「首次」的精確定義（2023 年財政部已對中國太平注資過 25 億元；財新更新版用語為「首次系統性納入」）、人保定增最終價格與股數、注資是否附帶條件、9 月 7 日以後的市場反應、以及 1 月彭博傳聞的 2,000 億為何縮水到 700 億。詳見第七部。</w:t>
       </w:r>
     </w:p>
     <w:p>
@@ -1768,7 +1778,7 @@
         <w:t>9 月 6 日的用語問題</w:t>
       </w:r>
       <w:r>
-        <w:t>：中新網、界面新聞標題寫「財政部</w:t>
+        <w:t>：中新網、界面新聞、央廣網標題寫「財政部</w:t>
       </w:r>
       <w:r>
         <w:rPr>
@@ -1777,22 +1787,22 @@
         <w:t>將</w:t>
       </w:r>
       <w:r>
-        <w:t>發行特別國債支持 8 家中央金融企業補充資本」，字面上像是要新發一批。但 (a) 2026 年預算只有這一筆 3,000 億元注資特別國債；(b) 財政部認購總額恰好 3,000 億元。本報告判斷九成以上是</w:t>
+        <w:t>發行（擬發行）3,000 億元特別國債支持 8 家中央金融企業補充核心一級資本」，字面上像是要新發一批。但 (a) 2026 年預算只有這一筆 3,000 億元注資特別國債；(b) 財政部認購總額恰好 3,000 億元；(c) 財新把銀行部分稱為「第二批特別國債注資銀行落地」（2,300 億元），加上保險 700 億元正好 3,000 億元。本報告判斷是</w:t>
       </w:r>
       <w:r>
         <w:rPr>
           <w:b/>
         </w:rPr>
-        <w:t>同一筆已發行的 3,000 億元</w:t>
+        <w:t>同一筆額度</w:t>
       </w:r>
       <w:r>
-        <w:t>，「將發行」可能是媒體轉述用語或指尚未完成的撥付程序。此點</w:t>
+        <w:t>；至於 5～6 月招標的是否已是全額、9 月是否還有後續發行或只是撥付，</w:t>
       </w:r>
       <w:r>
         <w:rPr>
           <w:b/>
         </w:rPr>
-        <w:t>待以財政部原文核實</w:t>
+        <w:t>待財政部原文核實</w:t>
       </w:r>
       <w:r>
         <w:t>。</w:t>
@@ -2857,16 +2867,23 @@
         <w:pStyle w:val="ListBullet"/>
       </w:pPr>
       <w:r>
-        <w:t>財新導語「比預期提前」「相應優化」：</w:t>
+        <w:t>財新導語「比預期提前」「相應優化」：9 月 7 日經財新站內搜尋摘要確認為原文導語，更新版保留同句；正文要點（經摘要）：這是保險機構首次被系統性納入國家金融機構資本補充框架；政府工作報告只提銀行，市場原以為保險要到 2027 年。</w:t>
       </w:r>
+    </w:p>
+    <w:p>
+      <w:pPr>
+        <w:pStyle w:val="ListBullet"/>
+      </w:pPr>
       <w:r>
-        <w:rPr>
-          <w:b/>
-        </w:rPr>
-        <w:t>未能在任何轉載或其他媒體找到相同或呼應的句子</w:t>
+        <w:t>南開大學金融學教授田利輝（京報網／大眾新聞，9/6）：要從制度變化與宏觀兩個維度理解。制度面，最低資本計量標準全面趨嚴、風險因子普遍上調，行業償付能力充足率面臨系統性下行壓力；宏觀面，長期利率持續走低，750 日移動平均國債收益率曲線不斷下行，倒逼保險公司增提準備金，核心資本被動消耗。注資目的在對沖低利率侵蝕。</w:t>
       </w:r>
+    </w:p>
+    <w:p>
+      <w:pPr>
+        <w:pStyle w:val="ListBullet"/>
+      </w:pPr>
       <w:r>
-        <w:t>，僅見於使用者提供的截圖。</w:t>
+        <w:t>業內人士（南方財經，9/6）：這是「股東層面的預防性資本補充」，直接增厚一級資本，以應對低利率週期，並為擴大長期資金入市提供支撐；「穩金融」由銀行擴圍至險企。</w:t>
       </w:r>
     </w:p>
     <w:p>
@@ -3776,7 +3793,7 @@
                 <w:b/>
                 <w:sz w:val="18"/>
               </w:rPr>
-              <w:t>8 家中央金融企業同步公告；財政部宣布特別國債支持 8 家補充核心一級資本；財新 17:37 發稿；人保晚間披露定增預案（定價不低於前 20 日均價、5 年鎖定）</w:t>
+              <w:t>8 家中央金融企業同步公告；財政部宣布特別國債支持 8 家補充核心一級資本；財新 17:37 發稿「4 家 670 億」、19:03 更新為「5 家 700 億」（補入中再 30 億）；人保晚間披露定增預案（定價不低於前 20 日均價、5 年鎖定）</w:t>
             </w:r>
           </w:p>
         </w:tc>
@@ -3913,7 +3930,7 @@
         <w:t>財政部第一次用「特別國債注資」這個原本專屬國有大行的工具，系統性地、同時對多家頭部保險機構補充資本</w:t>
       </w:r>
       <w:r>
-        <w:t>。彭博 1 月 30 日的報導用的也是這個定義（「extending a financing tool previously reserved for state-owned banks」）。2023 年那筆 25 億元是個案式的風險處置配套，規模與性質都不同。</w:t>
+        <w:t>。財新更新版的用語正是「保險機構首次被系統性納入國家金融機構資本補充框架」；彭博 1 月 30 日的報導用的也是這個定義（「extending a financing tool previously reserved for state-owned banks」）。2023 年那筆 25 億元是個案式的風險處置配套，規模與性質都不同。</w:t>
       </w:r>
     </w:p>
     <w:p>
@@ -4208,7 +4225,7 @@
     <w:p/>
     <w:p>
       <w:r>
-        <w:t>財新導語的「預期」最符合第二、三層：官方年度安排原本沒有保險，市場因此推斷要等到明年以後，如今卻在同一筆 3,000 億元裡「擠」出 700 億元給保險類機構。「相應優化」就是把原本市場以為全給銀行的額度，重新切成「銀行 2,000 億（差額由菸草系統補 600 億）+ 進出口銀行 300 億 + 保險類 700 億」。</w:t>
+        <w:t>財新導語的「預期」最符合第二、三層，財新更新版正文也是這樣解釋的：官方年度安排原本沒有保險，市場因此推斷要等到 2027 年，如今卻在同一筆 3,000 億元裡「擠」出 700 億元給保險類機構。「相應優化」就是把原本市場以為全給銀行的額度，重新切成「銀行 2,000 億（差額由菸草系統補 600 億）+ 進出口銀行 300 億 + 保險類 700 億」。</w:t>
       </w:r>
     </w:p>
     <w:p>
@@ -4294,6 +4311,14 @@
       </w:pPr>
       <w:r>
         <w:t>業界稱之為「三大壓力」（償二代二期全面執行、新準則切換、利率下行）。2026 年二季度末人身險公司平均核心償付能力充足率 119.6%、綜合 169.7%；二季度有 5 家險企未達標（行業數據，多來源一致）。</w:t>
+      </w:r>
+    </w:p>
+    <w:p>
+      <w:pPr>
+        <w:pStyle w:val="ListBullet"/>
+      </w:pPr>
+      <w:r>
+        <w:t>傳導機制（田利輝教授的說法）：壽險準備金折現率掛鉤 750 日移動平均國債收益率，利率一路下行，這條曲線就一路下降，保險公司被迫增提準備金，淨資產與核心資本被動消耗；再加上償二代二期把風險因子普遍上調，最低資本要求變高。分子變小、分母變大，充足率兩頭受壓。財政注資直接補分子。</w:t>
       </w:r>
     </w:p>
     <w:p>
@@ -6000,10 +6025,10 @@
         <w:rPr>
           <w:b/>
         </w:rPr>
-        <w:t>財新原文全文</w:t>
+        <w:t>財新正文全文</w:t>
       </w:r>
       <w:r>
-        <w:t>：導語「比預期提前…相應優化」僅見於截圖，正文是否點名 4 家、是否解釋「預期」與「相關部門」，未能核實。建議以財新訂閱帳號或微信轉載截圖取得全文。</w:t>
+        <w:t>：已確認導語為原文、更新版為「5 家 700 億」、正文解釋「預期」為市場原以為 2027 年；但全文仍未逐字取得，「相關部門」具體所指、是否有官方受訪者，未知。</w:t>
       </w:r>
     </w:p>
     <w:p>
@@ -6011,13 +6036,16 @@
         <w:pStyle w:val="ListNumber"/>
       </w:pPr>
       <w:r>
+        <w:t>~~「4 家」名單~~：</w:t>
+      </w:r>
+      <w:r>
         <w:rPr>
           <w:b/>
         </w:rPr>
-        <w:t>「4 家」名單</w:t>
+        <w:t>已解決</w:t>
       </w:r>
       <w:r>
-        <w:t>：本報告依算術（350+150+70+100=670）推定含中國信保、不含中國再保。若財新另有口徑，第一部表格需修正。</w:t>
+        <w:t>。財新更新版證實為人壽、人保、太平、信保 + 中再，合計 700 億元。</w:t>
       </w:r>
     </w:p>
     <w:p>
@@ -6031,7 +6059,7 @@
         <w:t>「首次」定義</w:t>
       </w:r>
       <w:r>
-        <w:t>：與 2023 年太平 25 億元先例的關係，需財新原文確認。</w:t>
+        <w:t>：財新用語為「首次系統性納入」，與 2023 年太平 25 億元先例不矛盾；財新是否在正文提及該先例，未知。</w:t>
       </w:r>
     </w:p>
     <w:p>
@@ -6560,6 +6588,62 @@
           </w:p>
         </w:tc>
       </w:tr>
+      <w:tr>
+        <w:tc>
+          <w:tcPr>
+            <w:tcW w:type="dxa" w:w="3324"/>
+          </w:tcPr>
+          <w:p>
+            <w:r>
+              <w:rPr>
+                <w:sz w:val="18"/>
+              </w:rPr>
+            </w:r>
+            <w:r>
+              <w:rPr>
+                <w:sz w:val="18"/>
+              </w:rPr>
+              <w:t>主代理 9/7 補查</w:t>
+            </w:r>
+          </w:p>
+        </w:tc>
+        <w:tc>
+          <w:tcPr>
+            <w:tcW w:type="dxa" w:w="3324"/>
+          </w:tcPr>
+          <w:p>
+            <w:r>
+              <w:rPr>
+                <w:sz w:val="18"/>
+              </w:rPr>
+            </w:r>
+            <w:r>
+              <w:rPr>
+                <w:sz w:val="18"/>
+              </w:rPr>
+              <w:t>財新更新版標題與導語要點、財新〈第二批特別國債注資銀行落地〉、京報網／北京商報／南方財經／澎湃專家解讀、人保定增預案（使用者提供）</w:t>
+            </w:r>
+          </w:p>
+        </w:tc>
+        <w:tc>
+          <w:tcPr>
+            <w:tcW w:type="dxa" w:w="3324"/>
+          </w:tcPr>
+          <w:p>
+            <w:r>
+              <w:rPr>
+                <w:sz w:val="18"/>
+              </w:rPr>
+            </w:r>
+            <w:r>
+              <w:rPr>
+                <w:sz w:val="18"/>
+              </w:rPr>
+              <w:t>解決名單與「預期」兩大不確定點</w:t>
+            </w:r>
+          </w:p>
+        </w:tc>
+      </w:tr>
     </w:tbl>
     <w:p/>
     <w:p>
@@ -6568,6 +6652,22 @@
       </w:pPr>
       <w:r>
         <w:t>三、主要來源（節錄；完整 URL 見各工單）</w:t>
+      </w:r>
+    </w:p>
+    <w:p>
+      <w:pPr>
+        <w:pStyle w:val="ListBullet"/>
+      </w:pPr>
+      <w:r>
+        <w:t>財新網：财政部首次注资险企 5家获700亿元（更新）（2026-09-06 19:03，https://finance.caixin.com/2026-09-06/102482419.html）；第二批特别国债注资银行落地 农行、工行、进出口行合计2300亿元（2026-09-06，https://finance.caixin.com/2026-09-06/102482427.html）；大型险企将获特别国债千亿注资？影响几何？（2026-02-03）</w:t>
+      </w:r>
+    </w:p>
+    <w:p>
+      <w:pPr>
+        <w:pStyle w:val="ListBullet"/>
+      </w:pPr>
+      <w:r>
+        <w:t>京報網／大眾新聞：五家保险央企同日获财政部注资，专家详解来了（2026-09-06）；北京商報：财政部向险企注资，五家险企获700亿元，资本消耗压力缓解；南方財經：“稳金融”扩围至险企；澎湃：财政部拟向5家保险公司增资700亿元；每經：财政部将发行3000亿元特别国债支持8家金融央企，释放什么信号？</w:t>
       </w:r>
     </w:p>
     <w:p>

</xml_diff>

<commit_message>
Incorporate Huaxia Times report: funding reallocation confirmed, industry solvency trend, expert views
Co-Authored-By: Claude Fable 5.1 <noreply@anthropic.com>
Claude-Session: https://claude.ai/code/session_01L8aigT8rcgficjTBusL67d
</commit_message>
<xml_diff>
--- a/mof-insurer-injection-2026-09/report.docx
+++ b/mof-insurer-injection-2026-09/report.docx
@@ -95,7 +95,7 @@
               <w:rPr>
                 <w:sz w:val="18"/>
               </w:rPr>
-              <w:t>2026 年 9 月 6 日初版；9 月 7 日補入人保定增預案條款、財新 19:03 更新版與專家解讀</w:t>
+              <w:t>2026 年 9 月 6 日初版；9 月 7 日補入人保定增預案條款、財新 19:03 更新版、華夏時報深度報導與專家解讀</w:t>
             </w:r>
           </w:p>
         </w:tc>
@@ -713,7 +713,7 @@
         <w:t>錢從哪裡來。</w:t>
       </w:r>
       <w:r>
-        <w:t xml:space="preserve"> 這是本次最重要的發現。同批 8 家機構增資總額 3,600 億元，其中財政部自己認購的部分加總正好是 </w:t>
+        <w:t xml:space="preserve"> 同批 8 家機構增資總額 3,600 億元，其中財政部自己認購的部分加總正好是 </w:t>
       </w:r>
       <w:r>
         <w:rPr>
@@ -722,7 +722,7 @@
         <w:t>3,000 億元</w:t>
       </w:r>
       <w:r>
-        <w:t>，與 2026 年《政府工作報告》宣布、並已於 5 月 22 日與 6 月 12 日分兩期發行完畢的「3,000 億元中央金融機構注資特別國債」規模完全一致。剩下 600 億元由中國菸草總公司及其子公司認購工行、農行的定增補足。</w:t>
+        <w:t>，與 2026 年《政府工作報告》宣布、並已於 5 月 22 日與 6 月 12 日分兩期發行完畢的「3,000 億元中央金融機構注資特別國債」規模完全一致。剩下 600 億元由中國菸草總公司及其子公司認購工行、農行的定增補足。華夏時報 9 月 7 日的報導把這點說白了：「3,000 億元特別國債額度中，約有 700 億元統籌調整至保險機構」，「並非額外新增獨立額度，而是在金融注資總盤子內…做出的動態優化配置」。本報告 9 月 6 日以算術推得的結論，已獲媒體證實。</w:t>
       </w:r>
     </w:p>
     <w:p>
@@ -1816,6 +1816,20 @@
         <w:rPr>
           <w:b/>
         </w:rPr>
+        <w:t>華夏時報的證實（9/7）</w:t>
+      </w:r>
+      <w:r>
+        <w:t>：「3,000 億元特別國債額度中，約有 700 億元統籌調整至保險機構。這意味著，本次險企注資並非額外新增獨立額度，而是在金融注資總盤子內，根據不同機構的實際資本需求做出的動態優化配置。」這句話同時回答了資金來源與「相應優化」兩個問題。</w:t>
+      </w:r>
+    </w:p>
+    <w:p>
+      <w:pPr>
+        <w:pStyle w:val="ListBullet"/>
+      </w:pPr>
+      <w:r>
+        <w:rPr>
+          <w:b/>
+        </w:rPr>
         <w:t>與 2025 年的對照</w:t>
       </w:r>
       <w:r>
@@ -2843,7 +2857,15 @@
         <w:pStyle w:val="ListBullet"/>
       </w:pPr>
       <w:r>
-        <w:t>中國人保：發行對象為財政部，以現金全額認購，募資不超過 150 億元，扣除費用後全部用於充實資本金。</w:t>
+        <w:t>中國人保：發行對象為財政部，以現金全額認購，募資不超過 150 億元，扣除費用後全部用於充實資本金。公告另稱（華夏時報引述）：「科技保險、健康保險、巨災保險等重點業務賽道加速擴容，中長期資金配置、重大項目投資的規模持續擴大，這些都對公司的資本儲備提出了更高的要求。」</w:t>
+      </w:r>
+    </w:p>
+    <w:p>
+      <w:pPr>
+        <w:pStyle w:val="ListBullet"/>
+      </w:pPr>
+      <w:r>
+        <w:t>中國再保（華夏時報引述）：發行價 1.33 元／股「較其近期 H 股二級市場價格實現溢價發行」，認購方承諾長期持有；「支持中央金融企業補充核心一級資本，是國家一攬子增量政策的重要組成部分」。</w:t>
       </w:r>
     </w:p>
     <w:p>
@@ -4313,6 +4335,313 @@
         <w:t>業界稱之為「三大壓力」（償二代二期全面執行、新準則切換、利率下行）。2026 年二季度末人身險公司平均核心償付能力充足率 119.6%、綜合 169.7%；二季度有 5 家險企未達標（行業數據，多來源一致）。</w:t>
       </w:r>
     </w:p>
+    <w:p>
+      <w:pPr>
+        <w:pStyle w:val="ListBullet"/>
+      </w:pPr>
+      <w:r>
+        <w:t>行業數字（華夏時報整理）：全行業平均綜合償付能力充足率由 2020 年末 246.3% 一路下滑，2022 年償二代二期落地當年降到 196%，2025 年末 181.1%，其中人身險公司 169.3%，較 2020 年高點回落近 80 個百分點；核心償付能力充足率由 2020 年約 230% 跌到 2025 年末約 130%。</w:t>
+      </w:r>
+    </w:p>
+    <w:tbl>
+      <w:tblPr>
+        <w:tblStyle w:val="TableGrid"/>
+        <w:tblW w:type="auto" w:w="0"/>
+        <w:tblLook w:firstColumn="1" w:firstRow="1" w:lastColumn="0" w:lastRow="0" w:noHBand="0" w:noVBand="1" w:val="04A0"/>
+      </w:tblPr>
+      <w:tblGrid>
+        <w:gridCol w:w="3324"/>
+        <w:gridCol w:w="3324"/>
+        <w:gridCol w:w="3324"/>
+      </w:tblGrid>
+      <w:tr>
+        <w:tc>
+          <w:tcPr>
+            <w:tcW w:type="dxa" w:w="3324"/>
+          </w:tcPr>
+          <w:p>
+            <w:r>
+              <w:rPr>
+                <w:b/>
+                <w:sz w:val="18"/>
+              </w:rPr>
+            </w:r>
+            <w:r>
+              <w:rPr>
+                <w:b/>
+                <w:sz w:val="18"/>
+              </w:rPr>
+              <w:t>年份</w:t>
+            </w:r>
+          </w:p>
+        </w:tc>
+        <w:tc>
+          <w:tcPr>
+            <w:tcW w:type="dxa" w:w="3324"/>
+          </w:tcPr>
+          <w:p>
+            <w:r>
+              <w:rPr>
+                <w:b/>
+                <w:sz w:val="18"/>
+              </w:rPr>
+            </w:r>
+            <w:r>
+              <w:rPr>
+                <w:b/>
+                <w:sz w:val="18"/>
+              </w:rPr>
+              <w:t>行業綜合償付能力充足率</w:t>
+            </w:r>
+          </w:p>
+        </w:tc>
+        <w:tc>
+          <w:tcPr>
+            <w:tcW w:type="dxa" w:w="3324"/>
+          </w:tcPr>
+          <w:p>
+            <w:r>
+              <w:rPr>
+                <w:b/>
+                <w:sz w:val="18"/>
+              </w:rPr>
+            </w:r>
+            <w:r>
+              <w:rPr>
+                <w:b/>
+                <w:sz w:val="18"/>
+              </w:rPr>
+              <w:t>行業核心償付能力充足率</w:t>
+            </w:r>
+          </w:p>
+        </w:tc>
+      </w:tr>
+      <w:tr>
+        <w:tc>
+          <w:tcPr>
+            <w:tcW w:type="dxa" w:w="3324"/>
+          </w:tcPr>
+          <w:p>
+            <w:r>
+              <w:rPr>
+                <w:sz w:val="18"/>
+              </w:rPr>
+            </w:r>
+            <w:r>
+              <w:rPr>
+                <w:sz w:val="18"/>
+              </w:rPr>
+              <w:t>2020 年末</w:t>
+            </w:r>
+          </w:p>
+        </w:tc>
+        <w:tc>
+          <w:tcPr>
+            <w:tcW w:type="dxa" w:w="3324"/>
+          </w:tcPr>
+          <w:p>
+            <w:r>
+              <w:rPr>
+                <w:sz w:val="18"/>
+              </w:rPr>
+            </w:r>
+            <w:r>
+              <w:rPr>
+                <w:sz w:val="18"/>
+              </w:rPr>
+              <w:t>246.3%</w:t>
+            </w:r>
+          </w:p>
+        </w:tc>
+        <w:tc>
+          <w:tcPr>
+            <w:tcW w:type="dxa" w:w="3324"/>
+          </w:tcPr>
+          <w:p>
+            <w:r>
+              <w:rPr>
+                <w:sz w:val="18"/>
+              </w:rPr>
+            </w:r>
+            <w:r>
+              <w:rPr>
+                <w:sz w:val="18"/>
+              </w:rPr>
+              <w:t>約 230%</w:t>
+            </w:r>
+          </w:p>
+        </w:tc>
+      </w:tr>
+      <w:tr>
+        <w:tc>
+          <w:tcPr>
+            <w:tcW w:type="dxa" w:w="3324"/>
+          </w:tcPr>
+          <w:p>
+            <w:r>
+              <w:rPr>
+                <w:sz w:val="18"/>
+              </w:rPr>
+            </w:r>
+            <w:r>
+              <w:rPr>
+                <w:sz w:val="18"/>
+              </w:rPr>
+              <w:t>2022 年末（償二代二期首年）</w:t>
+            </w:r>
+          </w:p>
+        </w:tc>
+        <w:tc>
+          <w:tcPr>
+            <w:tcW w:type="dxa" w:w="3324"/>
+          </w:tcPr>
+          <w:p>
+            <w:r>
+              <w:rPr>
+                <w:sz w:val="18"/>
+              </w:rPr>
+            </w:r>
+            <w:r>
+              <w:rPr>
+                <w:sz w:val="18"/>
+              </w:rPr>
+              <w:t>196%</w:t>
+            </w:r>
+          </w:p>
+        </w:tc>
+        <w:tc>
+          <w:tcPr>
+            <w:tcW w:type="dxa" w:w="3324"/>
+          </w:tcPr>
+          <w:p>
+            <w:r>
+              <w:rPr>
+                <w:sz w:val="18"/>
+              </w:rPr>
+            </w:r>
+            <w:r>
+              <w:rPr>
+                <w:sz w:val="18"/>
+              </w:rPr>
+              <w:t>—</w:t>
+            </w:r>
+          </w:p>
+        </w:tc>
+      </w:tr>
+      <w:tr>
+        <w:tc>
+          <w:tcPr>
+            <w:tcW w:type="dxa" w:w="3324"/>
+          </w:tcPr>
+          <w:p>
+            <w:r>
+              <w:rPr>
+                <w:sz w:val="18"/>
+              </w:rPr>
+            </w:r>
+            <w:r>
+              <w:rPr>
+                <w:sz w:val="18"/>
+              </w:rPr>
+              <w:t>2025 年末</w:t>
+            </w:r>
+          </w:p>
+        </w:tc>
+        <w:tc>
+          <w:tcPr>
+            <w:tcW w:type="dxa" w:w="3324"/>
+          </w:tcPr>
+          <w:p>
+            <w:r>
+              <w:rPr>
+                <w:sz w:val="18"/>
+              </w:rPr>
+            </w:r>
+            <w:r>
+              <w:rPr>
+                <w:sz w:val="18"/>
+              </w:rPr>
+              <w:t>181.1%（人身險 169.3%）</w:t>
+            </w:r>
+          </w:p>
+        </w:tc>
+        <w:tc>
+          <w:tcPr>
+            <w:tcW w:type="dxa" w:w="3324"/>
+          </w:tcPr>
+          <w:p>
+            <w:r>
+              <w:rPr>
+                <w:sz w:val="18"/>
+              </w:rPr>
+            </w:r>
+            <w:r>
+              <w:rPr>
+                <w:sz w:val="18"/>
+              </w:rPr>
+              <w:t>約 130%</w:t>
+            </w:r>
+          </w:p>
+        </w:tc>
+      </w:tr>
+      <w:tr>
+        <w:tc>
+          <w:tcPr>
+            <w:tcW w:type="dxa" w:w="3324"/>
+          </w:tcPr>
+          <w:p>
+            <w:r>
+              <w:rPr>
+                <w:sz w:val="18"/>
+              </w:rPr>
+            </w:r>
+            <w:r>
+              <w:rPr>
+                <w:sz w:val="18"/>
+              </w:rPr>
+              <w:t>2026 年二季度末（人身險）</w:t>
+            </w:r>
+          </w:p>
+        </w:tc>
+        <w:tc>
+          <w:tcPr>
+            <w:tcW w:type="dxa" w:w="3324"/>
+          </w:tcPr>
+          <w:p>
+            <w:r>
+              <w:rPr>
+                <w:sz w:val="18"/>
+              </w:rPr>
+            </w:r>
+            <w:r>
+              <w:rPr>
+                <w:sz w:val="18"/>
+              </w:rPr>
+              <w:t>169.7%</w:t>
+            </w:r>
+          </w:p>
+        </w:tc>
+        <w:tc>
+          <w:tcPr>
+            <w:tcW w:type="dxa" w:w="3324"/>
+          </w:tcPr>
+          <w:p>
+            <w:r>
+              <w:rPr>
+                <w:sz w:val="18"/>
+              </w:rPr>
+            </w:r>
+            <w:r>
+              <w:rPr>
+                <w:sz w:val="18"/>
+              </w:rPr>
+              <w:t>119.6%</w:t>
+            </w:r>
+          </w:p>
+        </w:tc>
+      </w:tr>
+    </w:tbl>
+    <w:p/>
     <w:p>
       <w:pPr>
         <w:pStyle w:val="ListBullet"/>
@@ -5089,7 +5418,571 @@
         <w:pStyle w:val="Heading3"/>
       </w:pPr>
       <w:r>
-        <w:t>五、國際先例對照</w:t>
+        <w:t>五、專家觀點彙整（華夏時報 9/7 訪談三位學者，加上京報網田利輝）</w:t>
+      </w:r>
+    </w:p>
+    <w:tbl>
+      <w:tblPr>
+        <w:tblStyle w:val="TableGrid"/>
+        <w:tblW w:type="auto" w:w="0"/>
+        <w:tblLook w:firstColumn="1" w:firstRow="1" w:lastColumn="0" w:lastRow="0" w:noHBand="0" w:noVBand="1" w:val="04A0"/>
+      </w:tblPr>
+      <w:tblGrid>
+        <w:gridCol w:w="2493"/>
+        <w:gridCol w:w="2493"/>
+        <w:gridCol w:w="2493"/>
+        <w:gridCol w:w="2493"/>
+      </w:tblGrid>
+      <w:tr>
+        <w:tc>
+          <w:tcPr>
+            <w:tcW w:type="dxa" w:w="2493"/>
+          </w:tcPr>
+          <w:p>
+            <w:r>
+              <w:rPr>
+                <w:b/>
+                <w:sz w:val="18"/>
+              </w:rPr>
+            </w:r>
+            <w:r>
+              <w:rPr>
+                <w:b/>
+                <w:sz w:val="18"/>
+              </w:rPr>
+              <w:t>議題</w:t>
+            </w:r>
+          </w:p>
+        </w:tc>
+        <w:tc>
+          <w:tcPr>
+            <w:tcW w:type="dxa" w:w="2493"/>
+          </w:tcPr>
+          <w:p>
+            <w:r>
+              <w:rPr>
+                <w:b/>
+                <w:sz w:val="18"/>
+              </w:rPr>
+            </w:r>
+            <w:r>
+              <w:rPr>
+                <w:b/>
+                <w:sz w:val="18"/>
+              </w:rPr>
+              <w:t>江翰（盤古智庫）</w:t>
+            </w:r>
+          </w:p>
+        </w:tc>
+        <w:tc>
+          <w:tcPr>
+            <w:tcW w:type="dxa" w:w="2493"/>
+          </w:tcPr>
+          <w:p>
+            <w:r>
+              <w:rPr>
+                <w:b/>
+                <w:sz w:val="18"/>
+              </w:rPr>
+            </w:r>
+            <w:r>
+              <w:rPr>
+                <w:b/>
+                <w:sz w:val="18"/>
+              </w:rPr>
+              <w:t>李文中（首都經貿大學）</w:t>
+            </w:r>
+          </w:p>
+        </w:tc>
+        <w:tc>
+          <w:tcPr>
+            <w:tcW w:type="dxa" w:w="2493"/>
+          </w:tcPr>
+          <w:p>
+            <w:r>
+              <w:rPr>
+                <w:b/>
+                <w:sz w:val="18"/>
+              </w:rPr>
+            </w:r>
+            <w:r>
+              <w:rPr>
+                <w:b/>
+                <w:sz w:val="18"/>
+              </w:rPr>
+              <w:t>朱俊生（北京大學）</w:t>
+            </w:r>
+          </w:p>
+        </w:tc>
+      </w:tr>
+      <w:tr>
+        <w:tc>
+          <w:tcPr>
+            <w:tcW w:type="dxa" w:w="2493"/>
+          </w:tcPr>
+          <w:p>
+            <w:r>
+              <w:rPr>
+                <w:sz w:val="18"/>
+              </w:rPr>
+            </w:r>
+            <w:r>
+              <w:rPr>
+                <w:sz w:val="18"/>
+              </w:rPr>
+              <w:t>定性</w:t>
+            </w:r>
+          </w:p>
+        </w:tc>
+        <w:tc>
+          <w:tcPr>
+            <w:tcW w:type="dxa" w:w="2493"/>
+          </w:tcPr>
+          <w:p>
+            <w:r>
+              <w:rPr>
+                <w:sz w:val="18"/>
+              </w:rPr>
+            </w:r>
+            <w:r>
+              <w:rPr>
+                <w:sz w:val="18"/>
+              </w:rPr>
+              <w:t>金融穩定保障體系從「分業局部風險處置」轉向「險企與國有大行並列的系統性事前加固框架」</w:t>
+            </w:r>
+          </w:p>
+        </w:tc>
+        <w:tc>
+          <w:tcPr>
+            <w:tcW w:type="dxa" w:w="2493"/>
+          </w:tcPr>
+          <w:p>
+            <w:r>
+              <w:rPr>
+                <w:sz w:val="18"/>
+              </w:rPr>
+            </w:r>
+            <w:r>
+              <w:rPr>
+                <w:sz w:val="18"/>
+              </w:rPr>
+              <w:t>從「銀行獨大」走向「銀保並重」；覆蓋銀行、保險、政策性金融的國有金融資本保障框架初步成型</w:t>
+            </w:r>
+          </w:p>
+        </w:tc>
+        <w:tc>
+          <w:tcPr>
+            <w:tcW w:type="dxa" w:w="2493"/>
+          </w:tcPr>
+          <w:p>
+            <w:r>
+              <w:rPr>
+                <w:sz w:val="18"/>
+              </w:rPr>
+            </w:r>
+            <w:r>
+              <w:rPr>
+                <w:sz w:val="18"/>
+              </w:rPr>
+              <w:t>前瞻性安排，為未來 5～10 年儲備資本，不是解決短期困難</w:t>
+            </w:r>
+          </w:p>
+        </w:tc>
+      </w:tr>
+      <w:tr>
+        <w:tc>
+          <w:tcPr>
+            <w:tcW w:type="dxa" w:w="2493"/>
+          </w:tcPr>
+          <w:p>
+            <w:r>
+              <w:rPr>
+                <w:sz w:val="18"/>
+              </w:rPr>
+            </w:r>
+            <w:r>
+              <w:rPr>
+                <w:sz w:val="18"/>
+              </w:rPr>
+              <w:t>時點</w:t>
+            </w:r>
+          </w:p>
+        </w:tc>
+        <w:tc>
+          <w:tcPr>
+            <w:tcW w:type="dxa" w:w="2493"/>
+          </w:tcPr>
+          <w:p>
+            <w:r>
+              <w:rPr>
+                <w:sz w:val="18"/>
+              </w:rPr>
+            </w:r>
+            <w:r>
+              <w:rPr>
+                <w:sz w:val="18"/>
+              </w:rPr>
+              <w:t>在利率下行、償二代二期壓力逼近臨界值前「筑牢底盤」</w:t>
+            </w:r>
+          </w:p>
+        </w:tc>
+        <w:tc>
+          <w:tcPr>
+            <w:tcW w:type="dxa" w:w="2493"/>
+          </w:tcPr>
+          <w:p>
+            <w:r>
+              <w:rPr>
+                <w:sz w:val="18"/>
+              </w:rPr>
+            </w:r>
+            <w:r>
+              <w:rPr>
+                <w:sz w:val="18"/>
+              </w:rPr>
+              <w:t>三重壓力：償二代二期、長期利率走低、監管引導加大權益配置</w:t>
+            </w:r>
+          </w:p>
+        </w:tc>
+        <w:tc>
+          <w:tcPr>
+            <w:tcW w:type="dxa" w:w="2493"/>
+          </w:tcPr>
+          <w:p>
+            <w:r>
+              <w:rPr>
+                <w:sz w:val="18"/>
+              </w:rPr>
+            </w:r>
+            <w:r>
+              <w:rPr>
+                <w:sz w:val="18"/>
+              </w:rPr>
+              <w:t>低利率下利差損風險上升、資本消耗加快</w:t>
+            </w:r>
+          </w:p>
+        </w:tc>
+      </w:tr>
+      <w:tr>
+        <w:tc>
+          <w:tcPr>
+            <w:tcW w:type="dxa" w:w="2493"/>
+          </w:tcPr>
+          <w:p>
+            <w:r>
+              <w:rPr>
+                <w:sz w:val="18"/>
+              </w:rPr>
+            </w:r>
+            <w:r>
+              <w:rPr>
+                <w:sz w:val="18"/>
+              </w:rPr>
+              <w:t>金額分配</w:t>
+            </w:r>
+          </w:p>
+        </w:tc>
+        <w:tc>
+          <w:tcPr>
+            <w:tcW w:type="dxa" w:w="2493"/>
+          </w:tcPr>
+          <w:p>
+            <w:r>
+              <w:rPr>
+                <w:sz w:val="18"/>
+              </w:rPr>
+            </w:r>
+            <w:r>
+              <w:rPr>
+                <w:sz w:val="18"/>
+              </w:rPr>
+              <w:t>按「戰略權重、資本缺口、公共職能」三維度匹配</w:t>
+            </w:r>
+          </w:p>
+        </w:tc>
+        <w:tc>
+          <w:tcPr>
+            <w:tcW w:type="dxa" w:w="2493"/>
+          </w:tcPr>
+          <w:p>
+            <w:r>
+              <w:rPr>
+                <w:sz w:val="18"/>
+              </w:rPr>
+            </w:r>
+            <w:r>
+              <w:rPr>
+                <w:sz w:val="18"/>
+              </w:rPr>
+              <w:t>「功能定位決定注資規模」：國壽最大因長期業務資本消耗快；人保承擔巨災、農險；信保支持外貿；太平跨境；中再需求較小</w:t>
+            </w:r>
+          </w:p>
+        </w:tc>
+        <w:tc>
+          <w:tcPr>
+            <w:tcW w:type="dxa" w:w="2493"/>
+          </w:tcPr>
+          <w:p>
+            <w:r>
+              <w:rPr>
+                <w:sz w:val="18"/>
+              </w:rPr>
+            </w:r>
+            <w:r>
+              <w:rPr>
+                <w:sz w:val="18"/>
+              </w:rPr>
+              <w:t>體現國家對各機構未來功能定位的安排</w:t>
+            </w:r>
+          </w:p>
+        </w:tc>
+      </w:tr>
+      <w:tr>
+        <w:tc>
+          <w:tcPr>
+            <w:tcW w:type="dxa" w:w="2493"/>
+          </w:tcPr>
+          <w:p>
+            <w:r>
+              <w:rPr>
+                <w:sz w:val="18"/>
+              </w:rPr>
+            </w:r>
+            <w:r>
+              <w:rPr>
+                <w:sz w:val="18"/>
+              </w:rPr>
+              <w:t>注資方式</w:t>
+            </w:r>
+          </w:p>
+        </w:tc>
+        <w:tc>
+          <w:tcPr>
+            <w:tcW w:type="dxa" w:w="2493"/>
+          </w:tcPr>
+          <w:p>
+            <w:r>
+              <w:rPr>
+                <w:sz w:val="18"/>
+              </w:rPr>
+            </w:r>
+            <w:r>
+              <w:rPr>
+                <w:sz w:val="18"/>
+              </w:rPr>
+              <w:t>非上市走直接注資可快速做實核心一級資本；上市走定增維持治理透明</w:t>
+            </w:r>
+          </w:p>
+        </w:tc>
+        <w:tc>
+          <w:tcPr>
+            <w:tcW w:type="dxa" w:w="2493"/>
+          </w:tcPr>
+          <w:p>
+            <w:r>
+              <w:rPr>
+                <w:sz w:val="18"/>
+              </w:rPr>
+            </w:r>
+            <w:r>
+              <w:rPr>
+                <w:sz w:val="18"/>
+              </w:rPr>
+              <w:t>直接注資也需股權評估作價以保障國有資產安全，程序較簡單</w:t>
+            </w:r>
+          </w:p>
+        </w:tc>
+        <w:tc>
+          <w:tcPr>
+            <w:tcW w:type="dxa" w:w="2493"/>
+          </w:tcPr>
+          <w:p>
+            <w:r>
+              <w:rPr>
+                <w:sz w:val="18"/>
+              </w:rPr>
+            </w:r>
+            <w:r>
+              <w:rPr>
+                <w:sz w:val="18"/>
+              </w:rPr>
+              <w:t>形式不同、本質相同，差異反映股權結構與治理安排</w:t>
+            </w:r>
+          </w:p>
+        </w:tc>
+      </w:tr>
+      <w:tr>
+        <w:tc>
+          <w:tcPr>
+            <w:tcW w:type="dxa" w:w="2493"/>
+          </w:tcPr>
+          <w:p>
+            <w:r>
+              <w:rPr>
+                <w:sz w:val="18"/>
+              </w:rPr>
+            </w:r>
+            <w:r>
+              <w:rPr>
+                <w:sz w:val="18"/>
+              </w:rPr>
+              <w:t>撬動效應</w:t>
+            </w:r>
+          </w:p>
+        </w:tc>
+        <w:tc>
+          <w:tcPr>
+            <w:tcW w:type="dxa" w:w="2493"/>
+          </w:tcPr>
+          <w:p>
+            <w:r>
+              <w:rPr>
+                <w:sz w:val="18"/>
+              </w:rPr>
+            </w:r>
+            <w:r>
+              <w:rPr>
+                <w:sz w:val="18"/>
+              </w:rPr>
+              <w:t>700 億不會全部直接入市，但可撬動數倍長期資本</w:t>
+            </w:r>
+          </w:p>
+        </w:tc>
+        <w:tc>
+          <w:tcPr>
+            <w:tcW w:type="dxa" w:w="2493"/>
+          </w:tcPr>
+          <w:p>
+            <w:r>
+              <w:rPr>
+                <w:sz w:val="18"/>
+              </w:rPr>
+            </w:r>
+            <w:r>
+              <w:rPr>
+                <w:sz w:val="18"/>
+              </w:rPr>
+              <w:t>可解開權益配置的「資本枷鎖」，大概撬動萬億級資金入市</w:t>
+            </w:r>
+          </w:p>
+        </w:tc>
+        <w:tc>
+          <w:tcPr>
+            <w:tcW w:type="dxa" w:w="2493"/>
+          </w:tcPr>
+          <w:p>
+            <w:r>
+              <w:rPr>
+                <w:sz w:val="18"/>
+              </w:rPr>
+            </w:r>
+            <w:r>
+              <w:rPr>
+                <w:sz w:val="18"/>
+              </w:rPr>
+              <w:t>有望撬動數千億元長期資金配置能力</w:t>
+            </w:r>
+          </w:p>
+        </w:tc>
+      </w:tr>
+      <w:tr>
+        <w:tc>
+          <w:tcPr>
+            <w:tcW w:type="dxa" w:w="2493"/>
+          </w:tcPr>
+          <w:p>
+            <w:r>
+              <w:rPr>
+                <w:sz w:val="18"/>
+              </w:rPr>
+            </w:r>
+            <w:r>
+              <w:rPr>
+                <w:sz w:val="18"/>
+              </w:rPr>
+              <w:t>行業格局</w:t>
+            </w:r>
+          </w:p>
+        </w:tc>
+        <w:tc>
+          <w:tcPr>
+            <w:tcW w:type="dxa" w:w="2493"/>
+          </w:tcPr>
+          <w:p>
+            <w:r>
+              <w:rPr>
+                <w:sz w:val="18"/>
+              </w:rPr>
+            </w:r>
+            <w:r>
+              <w:rPr>
+                <w:sz w:val="18"/>
+              </w:rPr>
+              <w:t>不會「大魚吃小魚」，會推動行業分層</w:t>
+            </w:r>
+          </w:p>
+        </w:tc>
+        <w:tc>
+          <w:tcPr>
+            <w:tcW w:type="dxa" w:w="2493"/>
+          </w:tcPr>
+          <w:p>
+            <w:r>
+              <w:rPr>
+                <w:sz w:val="18"/>
+              </w:rPr>
+            </w:r>
+            <w:r>
+              <w:rPr>
+                <w:sz w:val="18"/>
+              </w:rPr>
+              <w:t>馬太效應加劇，對中小公司不利，但頭部穩健也替中小分擔系統風險</w:t>
+            </w:r>
+          </w:p>
+        </w:tc>
+        <w:tc>
+          <w:tcPr>
+            <w:tcW w:type="dxa" w:w="2493"/>
+          </w:tcPr>
+          <w:p>
+            <w:r>
+              <w:rPr>
+                <w:sz w:val="18"/>
+              </w:rPr>
+            </w:r>
+            <w:r>
+              <w:rPr>
+                <w:sz w:val="18"/>
+              </w:rPr>
+              <w:t>集中度進一步提升，中小公司轉型壓力更大</w:t>
+            </w:r>
+          </w:p>
+        </w:tc>
+      </w:tr>
+    </w:tbl>
+    <w:p/>
+    <w:p>
+      <w:pPr>
+        <w:pStyle w:val="ListBullet"/>
+      </w:pPr>
+      <w:r>
+        <w:t>華夏時報另提醒：相對保險業數十萬億的資產負債規模，700 億元絕對值不大，意義在信號與撬動效應。</w:t>
+      </w:r>
+    </w:p>
+    <w:p>
+      <w:pPr>
+        <w:pStyle w:val="ListBullet"/>
+      </w:pPr>
+      <w:r>
+        <w:t>「行業救火隊」角色：2023 年處置華夏人壽時，國壽壽險、太平人壽等 11 家頭部壽險公司與地方政府、保險保障基金共同出資 339 億元成立專項基金承接資產負債；恒大人壽等處置也有頭部險企深度參與。頭部央企必須備有遠超行業平均的資本，這是注資的另一層理由。</w:t>
+      </w:r>
+    </w:p>
+    <w:p>
+      <w:pPr>
+        <w:pStyle w:val="Heading3"/>
+      </w:pPr>
+      <w:r>
+        <w:t>六、國際先例對照</w:t>
       </w:r>
     </w:p>
     <w:tbl>
@@ -6067,13 +6960,16 @@
         <w:pStyle w:val="ListNumber"/>
       </w:pPr>
       <w:r>
+        <w:t>~~3,000 億特別國債是否為同一筆~~：</w:t>
+      </w:r>
+      <w:r>
         <w:rPr>
           <w:b/>
         </w:rPr>
-        <w:t>3,000 億特別國債是否為同一筆</w:t>
+        <w:t>大致解決</w:t>
       </w:r>
       <w:r>
-        <w:t>：9 月 6 日「將發行」的措辭與 5～6 月已發行的事實有出入，需財政部原文。</w:t>
+        <w:t>。華夏時報明言 700 億元是從 3,000 億額度中統籌調整、非額外新增；財新亦以「第二批注資銀行 2,300 億」對應。僅「將發行」措辭是否另有後續發行動作，待財政部原文。</w:t>
       </w:r>
     </w:p>
     <w:p>
@@ -6621,7 +7517,20 @@
               <w:rPr>
                 <w:sz w:val="18"/>
               </w:rPr>
-              <w:t>財新更新版標題與導語要點、財新〈第二批特別國債注資銀行落地〉、京報網／北京商報／南方財經／澎湃專家解讀、人保定增預案（使用者提供）</w:t>
+              <w:t xml:space="preserve">財新更新版標題與導語要點、財新〈第二批特別國債注資銀行落地〉、京報網／北京商報／南方財經／澎湃專家解讀、人保定增預案與華夏時報全文（使用者提供，摘錄存於 </w:t>
+            </w:r>
+            <w:r>
+              <w:rPr>
+                <w:rFonts w:ascii="Consolas" w:hAnsi="Consolas"/>
+                <w:sz w:val="18"/>
+              </w:rPr>
+              <w:t>findings/SRC_huaxia_20260907.md</w:t>
+            </w:r>
+            <w:r>
+              <w:rPr>
+                <w:sz w:val="18"/>
+              </w:rPr>
+              <w:t>）</w:t>
             </w:r>
           </w:p>
         </w:tc>
@@ -6639,7 +7548,7 @@
               <w:rPr>
                 <w:sz w:val="18"/>
               </w:rPr>
-              <w:t>解決名單與「預期」兩大不確定點</w:t>
+              <w:t>解決名單、「預期」、資金來源三大不確定點</w:t>
             </w:r>
           </w:p>
         </w:tc>
@@ -6660,6 +7569,23 @@
       </w:pPr>
       <w:r>
         <w:t>財新網：财政部首次注资险企 5家获700亿元（更新）（2026-09-06 19:03，https://finance.caixin.com/2026-09-06/102482419.html）；第二批特别国债注资银行落地 农行、工行、进出口行合计2300亿元（2026-09-06，https://finance.caixin.com/2026-09-06/102482427.html）；大型险企将获特别国债千亿注资？影响几何？（2026-02-03）</w:t>
+      </w:r>
+    </w:p>
+    <w:p>
+      <w:pPr>
+        <w:pStyle w:val="ListBullet"/>
+      </w:pPr>
+      <w:r>
+        <w:t xml:space="preserve">華夏時報：首度跻身特别国债核心圈层，五家保险央企获财政部700亿元注资（吳敏，2026-09-07 11:28；使用者提供全文，摘錄存於 </w:t>
+      </w:r>
+      <w:r>
+        <w:rPr>
+          <w:rFonts w:ascii="Consolas" w:hAnsi="Consolas"/>
+        </w:rPr>
+        <w:t>findings/SRC_huaxia_20260907.md</w:t>
+      </w:r>
+      <w:r>
+        <w:t>）</w:t>
       </w:r>
     </w:p>
     <w:p>

</xml_diff>